<commit_message>
Actualización CU04, CU05, RN
</commit_message>
<xml_diff>
--- a/Casos de Uso/CU-04-Bandeja_Auxiliar.docx
+++ b/Casos de Uso/CU-04-Bandeja_Auxiliar.docx
@@ -1189,7 +1189,23 @@
           <w:szCs w:val="20"/>
           <w:lang w:val="es-ES_tradnl"/>
         </w:rPr>
-        <w:t>El sistema muestra el formulario bandeja auxiliar. RN16, FA01</w:t>
+        <w:t xml:space="preserve">El sistema muestra el formulario bandeja </w:t>
+      </w:r>
+      <w:r>
+        <w:rPr>
+          <w:sz w:val="20"/>
+          <w:szCs w:val="20"/>
+          <w:lang w:val="es-ES_tradnl"/>
+        </w:rPr>
+        <w:t>inicio</w:t>
+      </w:r>
+      <w:r>
+        <w:rPr>
+          <w:sz w:val="20"/>
+          <w:szCs w:val="20"/>
+          <w:lang w:val="es-ES_tradnl"/>
+        </w:rPr>
+        <w:t>. RN16, FA01</w:t>
       </w:r>
     </w:p>
     <w:p>
@@ -1317,7 +1333,23 @@
           <w:szCs w:val="20"/>
           <w:lang w:val="es-ES_tradnl"/>
         </w:rPr>
-        <w:t>El sistema muestra el formulario detalle auxiliar. RN17</w:t>
+        <w:t xml:space="preserve">El sistema muestra el formulario detalle </w:t>
+      </w:r>
+      <w:r>
+        <w:rPr>
+          <w:sz w:val="20"/>
+          <w:szCs w:val="20"/>
+          <w:lang w:val="es-ES_tradnl"/>
+        </w:rPr>
+        <w:t>inicio</w:t>
+      </w:r>
+      <w:r>
+        <w:rPr>
+          <w:sz w:val="20"/>
+          <w:szCs w:val="20"/>
+          <w:lang w:val="es-ES_tradnl"/>
+        </w:rPr>
+        <w:t>. RN17</w:t>
       </w:r>
     </w:p>
     <w:p>
@@ -1389,7 +1421,7 @@
           <w:szCs w:val="20"/>
           <w:lang w:val="es-ES_tradnl"/>
         </w:rPr>
-        <w:t>Se habilita el botón Regresar FA07 Regresar</w:t>
+        <w:t>Se habilita el botón Regresar FA07</w:t>
       </w:r>
     </w:p>
     <w:p>
@@ -1972,6 +2004,14 @@
         </w:rPr>
         <w:t>El Auxiliar selecciona “Aceptar” sin ampliación. FA03</w:t>
       </w:r>
+      <w:r>
+        <w:rPr>
+          <w:sz w:val="20"/>
+          <w:szCs w:val="20"/>
+          <w:lang w:val="es-ES_tradnl"/>
+        </w:rPr>
+        <w:t>, FA10</w:t>
+      </w:r>
     </w:p>
     <w:p>
       <w:pPr>
@@ -2936,6 +2976,132 @@
           <w:lang w:val="es-ES_tradnl"/>
         </w:rPr>
         <w:t>El sistema muestra la pantalla de inicio.</w:t>
+      </w:r>
+    </w:p>
+    <w:p>
+      <w:pPr>
+        <w:pStyle w:val="NormalWeb"/>
+        <w:spacing w:before="0" w:beforeAutospacing="0" w:after="0" w:afterAutospacing="0" w:line="360" w:lineRule="auto"/>
+        <w:ind w:left="357" w:right="301"/>
+        <w:rPr>
+          <w:b/>
+          <w:bCs/>
+          <w:sz w:val="20"/>
+          <w:szCs w:val="20"/>
+          <w:lang w:val="es-ES_tradnl"/>
+        </w:rPr>
+      </w:pPr>
+      <w:r>
+        <w:rPr>
+          <w:b/>
+          <w:bCs/>
+          <w:sz w:val="20"/>
+          <w:szCs w:val="20"/>
+          <w:lang w:val="es-ES_tradnl"/>
+        </w:rPr>
+        <w:t>FA</w:t>
+      </w:r>
+      <w:r>
+        <w:rPr>
+          <w:b/>
+          <w:bCs/>
+          <w:sz w:val="20"/>
+          <w:szCs w:val="20"/>
+          <w:lang w:val="es-ES_tradnl"/>
+        </w:rPr>
+        <w:t>10</w:t>
+      </w:r>
+      <w:r>
+        <w:rPr>
+          <w:b/>
+          <w:bCs/>
+          <w:sz w:val="20"/>
+          <w:szCs w:val="20"/>
+          <w:lang w:val="es-ES_tradnl"/>
+        </w:rPr>
+        <w:t xml:space="preserve"> </w:t>
+      </w:r>
+      <w:r>
+        <w:rPr>
+          <w:b/>
+          <w:bCs/>
+          <w:sz w:val="20"/>
+          <w:szCs w:val="20"/>
+          <w:lang w:val="es-ES_tradnl"/>
+        </w:rPr>
+        <w:t>Campos Obligatorios</w:t>
+      </w:r>
+    </w:p>
+    <w:p>
+      <w:pPr>
+        <w:pStyle w:val="NormalWeb"/>
+        <w:numPr>
+          <w:ilvl w:val="0"/>
+          <w:numId w:val="21"/>
+        </w:numPr>
+        <w:spacing w:before="0" w:beforeAutospacing="0" w:after="0" w:afterAutospacing="0" w:line="360" w:lineRule="auto"/>
+        <w:ind w:right="301"/>
+        <w:rPr>
+          <w:sz w:val="20"/>
+          <w:szCs w:val="20"/>
+          <w:lang w:val="es-ES_tradnl"/>
+        </w:rPr>
+      </w:pPr>
+      <w:r>
+        <w:rPr>
+          <w:sz w:val="20"/>
+          <w:szCs w:val="20"/>
+          <w:lang w:val="es-ES_tradnl"/>
+        </w:rPr>
+        <w:t>El sistema valida que los campos obligatorios hayan sido llenados.</w:t>
+      </w:r>
+    </w:p>
+    <w:p>
+      <w:pPr>
+        <w:pStyle w:val="NormalWeb"/>
+        <w:numPr>
+          <w:ilvl w:val="0"/>
+          <w:numId w:val="21"/>
+        </w:numPr>
+        <w:spacing w:before="0" w:beforeAutospacing="0" w:after="0" w:afterAutospacing="0" w:line="360" w:lineRule="auto"/>
+        <w:ind w:right="301"/>
+        <w:rPr>
+          <w:sz w:val="20"/>
+          <w:szCs w:val="20"/>
+          <w:lang w:val="es-ES_tradnl"/>
+        </w:rPr>
+      </w:pPr>
+      <w:r>
+        <w:rPr>
+          <w:sz w:val="20"/>
+          <w:szCs w:val="20"/>
+          <w:lang w:val="es-ES_tradnl"/>
+        </w:rPr>
+        <w:t>El sistema despliega el mensaje de error. AN02 # 7</w:t>
+      </w:r>
+    </w:p>
+    <w:p>
+      <w:pPr>
+        <w:pStyle w:val="NormalWeb"/>
+        <w:numPr>
+          <w:ilvl w:val="0"/>
+          <w:numId w:val="21"/>
+        </w:numPr>
+        <w:spacing w:before="0" w:beforeAutospacing="0" w:after="0" w:afterAutospacing="0" w:line="360" w:lineRule="auto"/>
+        <w:ind w:right="301"/>
+        <w:rPr>
+          <w:sz w:val="20"/>
+          <w:szCs w:val="20"/>
+          <w:lang w:val="es-ES_tradnl"/>
+        </w:rPr>
+      </w:pPr>
+      <w:r>
+        <w:rPr>
+          <w:sz w:val="20"/>
+          <w:szCs w:val="20"/>
+          <w:lang w:val="es-ES_tradnl"/>
+        </w:rPr>
+        <w:t>El sistema permanece en el formulario.</w:t>
       </w:r>
     </w:p>
     <w:p>
@@ -2971,6 +3137,134 @@
         <w:pStyle w:val="NormalWeb"/>
         <w:numPr>
           <w:ilvl w:val="0"/>
+          <w:numId w:val="22"/>
+        </w:numPr>
+        <w:spacing w:before="0" w:beforeAutospacing="0" w:after="0" w:afterAutospacing="0" w:line="360" w:lineRule="auto"/>
+        <w:ind w:right="301"/>
+        <w:rPr>
+          <w:sz w:val="20"/>
+          <w:szCs w:val="20"/>
+          <w:lang w:val="es-ES_tradnl"/>
+        </w:rPr>
+      </w:pPr>
+      <w:r>
+        <w:rPr>
+          <w:sz w:val="20"/>
+          <w:szCs w:val="20"/>
+          <w:lang w:val="es-ES_tradnl"/>
+        </w:rPr>
+        <w:t>El caso queda en estado En Atención, asignado a un Técnico, cuando el Auxiliar lo acepta.</w:t>
+      </w:r>
+    </w:p>
+    <w:p>
+      <w:pPr>
+        <w:pStyle w:val="NormalWeb"/>
+        <w:numPr>
+          <w:ilvl w:val="0"/>
+          <w:numId w:val="22"/>
+        </w:numPr>
+        <w:spacing w:before="0" w:beforeAutospacing="0" w:after="0" w:afterAutospacing="0" w:line="360" w:lineRule="auto"/>
+        <w:ind w:right="301"/>
+        <w:rPr>
+          <w:sz w:val="20"/>
+          <w:szCs w:val="20"/>
+          <w:lang w:val="es-ES_tradnl"/>
+        </w:rPr>
+      </w:pPr>
+      <w:r>
+        <w:rPr>
+          <w:sz w:val="20"/>
+          <w:szCs w:val="20"/>
+          <w:lang w:val="es-ES_tradnl"/>
+        </w:rPr>
+        <w:t>El caso queda en estado Pendiente de Aprobación de Rechazo, a la espera del Supervisor, cuando el Auxiliar lo rechaza</w:t>
+      </w:r>
+      <w:r>
+        <w:rPr>
+          <w:sz w:val="20"/>
+          <w:szCs w:val="20"/>
+          <w:lang w:val="es-ES_tradnl"/>
+        </w:rPr>
+        <w:t xml:space="preserve"> sin solicitar ampliación</w:t>
+      </w:r>
+      <w:r>
+        <w:rPr>
+          <w:sz w:val="20"/>
+          <w:szCs w:val="20"/>
+          <w:lang w:val="es-ES_tradnl"/>
+        </w:rPr>
+        <w:t>.</w:t>
+      </w:r>
+    </w:p>
+    <w:p>
+      <w:pPr>
+        <w:pStyle w:val="NormalWeb"/>
+        <w:numPr>
+          <w:ilvl w:val="0"/>
+          <w:numId w:val="22"/>
+        </w:numPr>
+        <w:spacing w:before="0" w:beforeAutospacing="0" w:after="0" w:afterAutospacing="0" w:line="360" w:lineRule="auto"/>
+        <w:ind w:right="301"/>
+        <w:rPr>
+          <w:sz w:val="20"/>
+          <w:szCs w:val="20"/>
+          <w:lang w:val="es-ES_tradnl"/>
+        </w:rPr>
+      </w:pPr>
+      <w:r>
+        <w:rPr>
+          <w:sz w:val="20"/>
+          <w:szCs w:val="20"/>
+          <w:lang w:val="es-ES_tradnl"/>
+        </w:rPr>
+        <w:t xml:space="preserve">Cuando el rechazo </w:t>
+      </w:r>
+      <w:r>
+        <w:rPr>
+          <w:sz w:val="20"/>
+          <w:szCs w:val="20"/>
+          <w:lang w:val="es-ES_tradnl"/>
+        </w:rPr>
+        <w:t>solicita ampliación</w:t>
+      </w:r>
+      <w:r>
+        <w:rPr>
+          <w:sz w:val="20"/>
+          <w:szCs w:val="20"/>
+          <w:lang w:val="es-ES_tradnl"/>
+        </w:rPr>
+        <w:t>, el ciudadano recibe una notificación por correo con las instrucciones correspondientes.</w:t>
+      </w:r>
+    </w:p>
+    <w:p>
+      <w:pPr>
+        <w:pStyle w:val="NormalWeb"/>
+        <w:numPr>
+          <w:ilvl w:val="0"/>
+          <w:numId w:val="22"/>
+        </w:numPr>
+        <w:spacing w:before="0" w:beforeAutospacing="0" w:after="0" w:afterAutospacing="0" w:line="360" w:lineRule="auto"/>
+        <w:ind w:right="301"/>
+        <w:rPr>
+          <w:sz w:val="20"/>
+          <w:szCs w:val="20"/>
+          <w:lang w:val="es-ES_tradnl"/>
+        </w:rPr>
+      </w:pPr>
+      <w:r>
+        <w:rPr>
+          <w:sz w:val="20"/>
+          <w:szCs w:val="20"/>
+          <w:lang w:val="es-ES_tradnl"/>
+        </w:rPr>
+        <w:t>4. El sistema registra en bitácora la decisión tomada por el Auxiliar.</w:t>
+      </w:r>
+    </w:p>
+    <w:p>
+      <w:pPr>
+        <w:pStyle w:val="NormalWeb"/>
+        <w:numPr>
+          <w:ilvl w:val="0"/>
           <w:numId w:val="7"/>
         </w:numPr>
         <w:spacing w:line="360" w:lineRule="auto"/>
@@ -3012,6 +3306,54 @@
           <w:lang w:val="es-ES_tradnl"/>
         </w:rPr>
         <w:t>Funcionales</w:t>
+      </w:r>
+    </w:p>
+    <w:p>
+      <w:pPr>
+        <w:pStyle w:val="NormalWeb"/>
+        <w:numPr>
+          <w:ilvl w:val="0"/>
+          <w:numId w:val="23"/>
+        </w:numPr>
+        <w:spacing w:before="0" w:beforeAutospacing="0" w:after="0" w:afterAutospacing="0" w:line="360" w:lineRule="auto"/>
+        <w:ind w:right="301"/>
+        <w:rPr>
+          <w:sz w:val="20"/>
+          <w:szCs w:val="20"/>
+          <w:lang w:val="es-ES_tradnl"/>
+        </w:rPr>
+      </w:pPr>
+      <w:r>
+        <w:rPr>
+          <w:sz w:val="20"/>
+          <w:szCs w:val="20"/>
+          <w:lang w:val="es-ES_tradnl"/>
+        </w:rPr>
+        <w:t>El formulario deberá utilizar conexión segura HTTPS.</w:t>
+      </w:r>
+    </w:p>
+    <w:p>
+      <w:pPr>
+        <w:pStyle w:val="NormalWeb"/>
+        <w:numPr>
+          <w:ilvl w:val="0"/>
+          <w:numId w:val="23"/>
+        </w:numPr>
+        <w:spacing w:before="0" w:beforeAutospacing="0" w:after="0" w:afterAutospacing="0" w:line="360" w:lineRule="auto"/>
+        <w:ind w:right="301"/>
+        <w:rPr>
+          <w:sz w:val="20"/>
+          <w:szCs w:val="20"/>
+          <w:lang w:val="es-ES_tradnl"/>
+        </w:rPr>
+      </w:pPr>
+      <w:r>
+        <w:rPr>
+          <w:sz w:val="20"/>
+          <w:szCs w:val="20"/>
+          <w:lang w:val="es-ES_tradnl"/>
+        </w:rPr>
+        <w:t>El sistema deberá registrar en bitácora cada decisión de revisión.</w:t>
       </w:r>
     </w:p>
     <w:p>
@@ -3836,6 +4178,95 @@
     </w:lvl>
   </w:abstractNum>
   <w:abstractNum w:abstractNumId="5" w15:restartNumberingAfterBreak="0">
+    <w:nsid w:val="1C4F3182"/>
+    <w:multiLevelType w:val="hybridMultilevel"/>
+    <w:tmpl w:val="02BE9A90"/>
+    <w:lvl w:ilvl="0" w:tplc="FFFFFFFF">
+      <w:start w:val="1"/>
+      <w:numFmt w:val="decimal"/>
+      <w:lvlText w:val="%1."/>
+      <w:lvlJc w:val="left"/>
+      <w:pPr>
+        <w:ind w:left="1068" w:hanging="360"/>
+      </w:pPr>
+      <w:rPr>
+        <w:rFonts w:hint="default"/>
+      </w:rPr>
+    </w:lvl>
+    <w:lvl w:ilvl="1" w:tplc="FFFFFFFF">
+      <w:start w:val="1"/>
+      <w:numFmt w:val="lowerLetter"/>
+      <w:lvlText w:val="%2."/>
+      <w:lvlJc w:val="left"/>
+      <w:pPr>
+        <w:ind w:left="1440" w:hanging="360"/>
+      </w:pPr>
+    </w:lvl>
+    <w:lvl w:ilvl="2" w:tplc="FFFFFFFF" w:tentative="1">
+      <w:start w:val="1"/>
+      <w:numFmt w:val="lowerRoman"/>
+      <w:lvlText w:val="%3."/>
+      <w:lvlJc w:val="right"/>
+      <w:pPr>
+        <w:ind w:left="2160" w:hanging="180"/>
+      </w:pPr>
+    </w:lvl>
+    <w:lvl w:ilvl="3" w:tplc="FFFFFFFF" w:tentative="1">
+      <w:start w:val="1"/>
+      <w:numFmt w:val="decimal"/>
+      <w:lvlText w:val="%4."/>
+      <w:lvlJc w:val="left"/>
+      <w:pPr>
+        <w:ind w:left="2880" w:hanging="360"/>
+      </w:pPr>
+    </w:lvl>
+    <w:lvl w:ilvl="4" w:tplc="FFFFFFFF" w:tentative="1">
+      <w:start w:val="1"/>
+      <w:numFmt w:val="lowerLetter"/>
+      <w:lvlText w:val="%5."/>
+      <w:lvlJc w:val="left"/>
+      <w:pPr>
+        <w:ind w:left="3600" w:hanging="360"/>
+      </w:pPr>
+    </w:lvl>
+    <w:lvl w:ilvl="5" w:tplc="FFFFFFFF" w:tentative="1">
+      <w:start w:val="1"/>
+      <w:numFmt w:val="lowerRoman"/>
+      <w:lvlText w:val="%6."/>
+      <w:lvlJc w:val="right"/>
+      <w:pPr>
+        <w:ind w:left="4320" w:hanging="180"/>
+      </w:pPr>
+    </w:lvl>
+    <w:lvl w:ilvl="6" w:tplc="FFFFFFFF" w:tentative="1">
+      <w:start w:val="1"/>
+      <w:numFmt w:val="decimal"/>
+      <w:lvlText w:val="%7."/>
+      <w:lvlJc w:val="left"/>
+      <w:pPr>
+        <w:ind w:left="5040" w:hanging="360"/>
+      </w:pPr>
+    </w:lvl>
+    <w:lvl w:ilvl="7" w:tplc="FFFFFFFF" w:tentative="1">
+      <w:start w:val="1"/>
+      <w:numFmt w:val="lowerLetter"/>
+      <w:lvlText w:val="%8."/>
+      <w:lvlJc w:val="left"/>
+      <w:pPr>
+        <w:ind w:left="5760" w:hanging="360"/>
+      </w:pPr>
+    </w:lvl>
+    <w:lvl w:ilvl="8" w:tplc="FFFFFFFF" w:tentative="1">
+      <w:start w:val="1"/>
+      <w:numFmt w:val="lowerRoman"/>
+      <w:lvlText w:val="%9."/>
+      <w:lvlJc w:val="right"/>
+      <w:pPr>
+        <w:ind w:left="6480" w:hanging="180"/>
+      </w:pPr>
+    </w:lvl>
+  </w:abstractNum>
+  <w:abstractNum w:abstractNumId="6" w15:restartNumberingAfterBreak="0">
     <w:nsid w:val="1F390D10"/>
     <w:multiLevelType w:val="singleLevel"/>
     <w:tmpl w:val="4D90F492"/>
@@ -3850,7 +4281,7 @@
       </w:pPr>
     </w:lvl>
   </w:abstractNum>
-  <w:abstractNum w:abstractNumId="6" w15:restartNumberingAfterBreak="0">
+  <w:abstractNum w:abstractNumId="7" w15:restartNumberingAfterBreak="0">
     <w:nsid w:val="2EAD69B2"/>
     <w:multiLevelType w:val="singleLevel"/>
     <w:tmpl w:val="4D90F492"/>
@@ -3865,7 +4296,7 @@
       </w:pPr>
     </w:lvl>
   </w:abstractNum>
-  <w:abstractNum w:abstractNumId="7" w15:restartNumberingAfterBreak="0">
+  <w:abstractNum w:abstractNumId="8" w15:restartNumberingAfterBreak="0">
     <w:nsid w:val="3173340E"/>
     <w:multiLevelType w:val="hybridMultilevel"/>
     <w:tmpl w:val="96A4A986"/>
@@ -3954,7 +4385,96 @@
       </w:pPr>
     </w:lvl>
   </w:abstractNum>
-  <w:abstractNum w:abstractNumId="8" w15:restartNumberingAfterBreak="0">
+  <w:abstractNum w:abstractNumId="9" w15:restartNumberingAfterBreak="0">
+    <w:nsid w:val="397A2EA9"/>
+    <w:multiLevelType w:val="hybridMultilevel"/>
+    <w:tmpl w:val="02BE9A90"/>
+    <w:lvl w:ilvl="0" w:tplc="FFFFFFFF">
+      <w:start w:val="1"/>
+      <w:numFmt w:val="decimal"/>
+      <w:lvlText w:val="%1."/>
+      <w:lvlJc w:val="left"/>
+      <w:pPr>
+        <w:ind w:left="1068" w:hanging="360"/>
+      </w:pPr>
+      <w:rPr>
+        <w:rFonts w:hint="default"/>
+      </w:rPr>
+    </w:lvl>
+    <w:lvl w:ilvl="1" w:tplc="FFFFFFFF">
+      <w:start w:val="1"/>
+      <w:numFmt w:val="lowerLetter"/>
+      <w:lvlText w:val="%2."/>
+      <w:lvlJc w:val="left"/>
+      <w:pPr>
+        <w:ind w:left="1440" w:hanging="360"/>
+      </w:pPr>
+    </w:lvl>
+    <w:lvl w:ilvl="2" w:tplc="FFFFFFFF" w:tentative="1">
+      <w:start w:val="1"/>
+      <w:numFmt w:val="lowerRoman"/>
+      <w:lvlText w:val="%3."/>
+      <w:lvlJc w:val="right"/>
+      <w:pPr>
+        <w:ind w:left="2160" w:hanging="180"/>
+      </w:pPr>
+    </w:lvl>
+    <w:lvl w:ilvl="3" w:tplc="FFFFFFFF" w:tentative="1">
+      <w:start w:val="1"/>
+      <w:numFmt w:val="decimal"/>
+      <w:lvlText w:val="%4."/>
+      <w:lvlJc w:val="left"/>
+      <w:pPr>
+        <w:ind w:left="2880" w:hanging="360"/>
+      </w:pPr>
+    </w:lvl>
+    <w:lvl w:ilvl="4" w:tplc="FFFFFFFF" w:tentative="1">
+      <w:start w:val="1"/>
+      <w:numFmt w:val="lowerLetter"/>
+      <w:lvlText w:val="%5."/>
+      <w:lvlJc w:val="left"/>
+      <w:pPr>
+        <w:ind w:left="3600" w:hanging="360"/>
+      </w:pPr>
+    </w:lvl>
+    <w:lvl w:ilvl="5" w:tplc="FFFFFFFF" w:tentative="1">
+      <w:start w:val="1"/>
+      <w:numFmt w:val="lowerRoman"/>
+      <w:lvlText w:val="%6."/>
+      <w:lvlJc w:val="right"/>
+      <w:pPr>
+        <w:ind w:left="4320" w:hanging="180"/>
+      </w:pPr>
+    </w:lvl>
+    <w:lvl w:ilvl="6" w:tplc="FFFFFFFF" w:tentative="1">
+      <w:start w:val="1"/>
+      <w:numFmt w:val="decimal"/>
+      <w:lvlText w:val="%7."/>
+      <w:lvlJc w:val="left"/>
+      <w:pPr>
+        <w:ind w:left="5040" w:hanging="360"/>
+      </w:pPr>
+    </w:lvl>
+    <w:lvl w:ilvl="7" w:tplc="FFFFFFFF" w:tentative="1">
+      <w:start w:val="1"/>
+      <w:numFmt w:val="lowerLetter"/>
+      <w:lvlText w:val="%8."/>
+      <w:lvlJc w:val="left"/>
+      <w:pPr>
+        <w:ind w:left="5760" w:hanging="360"/>
+      </w:pPr>
+    </w:lvl>
+    <w:lvl w:ilvl="8" w:tplc="FFFFFFFF" w:tentative="1">
+      <w:start w:val="1"/>
+      <w:numFmt w:val="lowerRoman"/>
+      <w:lvlText w:val="%9."/>
+      <w:lvlJc w:val="right"/>
+      <w:pPr>
+        <w:ind w:left="6480" w:hanging="180"/>
+      </w:pPr>
+    </w:lvl>
+  </w:abstractNum>
+  <w:abstractNum w:abstractNumId="10" w15:restartNumberingAfterBreak="0">
     <w:nsid w:val="3D441E1C"/>
     <w:multiLevelType w:val="multilevel"/>
     <w:tmpl w:val="0409001F"/>
@@ -4043,7 +4563,7 @@
       </w:pPr>
     </w:lvl>
   </w:abstractNum>
-  <w:abstractNum w:abstractNumId="9" w15:restartNumberingAfterBreak="0">
+  <w:abstractNum w:abstractNumId="11" w15:restartNumberingAfterBreak="0">
     <w:nsid w:val="468E7701"/>
     <w:multiLevelType w:val="multilevel"/>
     <w:tmpl w:val="85A0DEC6"/>
@@ -4192,7 +4712,7 @@
       </w:rPr>
     </w:lvl>
   </w:abstractNum>
-  <w:abstractNum w:abstractNumId="10" w15:restartNumberingAfterBreak="0">
+  <w:abstractNum w:abstractNumId="12" w15:restartNumberingAfterBreak="0">
     <w:nsid w:val="4E6303D2"/>
     <w:multiLevelType w:val="hybridMultilevel"/>
     <w:tmpl w:val="B3D80B02"/>
@@ -4281,7 +4801,7 @@
       </w:pPr>
     </w:lvl>
   </w:abstractNum>
-  <w:abstractNum w:abstractNumId="11" w15:restartNumberingAfterBreak="0">
+  <w:abstractNum w:abstractNumId="13" w15:restartNumberingAfterBreak="0">
     <w:nsid w:val="4F3563D7"/>
     <w:multiLevelType w:val="hybridMultilevel"/>
     <w:tmpl w:val="02BE9A90"/>
@@ -4370,7 +4890,96 @@
       </w:pPr>
     </w:lvl>
   </w:abstractNum>
-  <w:abstractNum w:abstractNumId="12" w15:restartNumberingAfterBreak="0">
+  <w:abstractNum w:abstractNumId="14" w15:restartNumberingAfterBreak="0">
+    <w:nsid w:val="57F171A6"/>
+    <w:multiLevelType w:val="hybridMultilevel"/>
+    <w:tmpl w:val="02BE9A90"/>
+    <w:lvl w:ilvl="0" w:tplc="FFFFFFFF">
+      <w:start w:val="1"/>
+      <w:numFmt w:val="decimal"/>
+      <w:lvlText w:val="%1."/>
+      <w:lvlJc w:val="left"/>
+      <w:pPr>
+        <w:ind w:left="1068" w:hanging="360"/>
+      </w:pPr>
+      <w:rPr>
+        <w:rFonts w:hint="default"/>
+      </w:rPr>
+    </w:lvl>
+    <w:lvl w:ilvl="1" w:tplc="FFFFFFFF">
+      <w:start w:val="1"/>
+      <w:numFmt w:val="lowerLetter"/>
+      <w:lvlText w:val="%2."/>
+      <w:lvlJc w:val="left"/>
+      <w:pPr>
+        <w:ind w:left="1440" w:hanging="360"/>
+      </w:pPr>
+    </w:lvl>
+    <w:lvl w:ilvl="2" w:tplc="FFFFFFFF" w:tentative="1">
+      <w:start w:val="1"/>
+      <w:numFmt w:val="lowerRoman"/>
+      <w:lvlText w:val="%3."/>
+      <w:lvlJc w:val="right"/>
+      <w:pPr>
+        <w:ind w:left="2160" w:hanging="180"/>
+      </w:pPr>
+    </w:lvl>
+    <w:lvl w:ilvl="3" w:tplc="FFFFFFFF" w:tentative="1">
+      <w:start w:val="1"/>
+      <w:numFmt w:val="decimal"/>
+      <w:lvlText w:val="%4."/>
+      <w:lvlJc w:val="left"/>
+      <w:pPr>
+        <w:ind w:left="2880" w:hanging="360"/>
+      </w:pPr>
+    </w:lvl>
+    <w:lvl w:ilvl="4" w:tplc="FFFFFFFF" w:tentative="1">
+      <w:start w:val="1"/>
+      <w:numFmt w:val="lowerLetter"/>
+      <w:lvlText w:val="%5."/>
+      <w:lvlJc w:val="left"/>
+      <w:pPr>
+        <w:ind w:left="3600" w:hanging="360"/>
+      </w:pPr>
+    </w:lvl>
+    <w:lvl w:ilvl="5" w:tplc="FFFFFFFF" w:tentative="1">
+      <w:start w:val="1"/>
+      <w:numFmt w:val="lowerRoman"/>
+      <w:lvlText w:val="%6."/>
+      <w:lvlJc w:val="right"/>
+      <w:pPr>
+        <w:ind w:left="4320" w:hanging="180"/>
+      </w:pPr>
+    </w:lvl>
+    <w:lvl w:ilvl="6" w:tplc="FFFFFFFF" w:tentative="1">
+      <w:start w:val="1"/>
+      <w:numFmt w:val="decimal"/>
+      <w:lvlText w:val="%7."/>
+      <w:lvlJc w:val="left"/>
+      <w:pPr>
+        <w:ind w:left="5040" w:hanging="360"/>
+      </w:pPr>
+    </w:lvl>
+    <w:lvl w:ilvl="7" w:tplc="FFFFFFFF" w:tentative="1">
+      <w:start w:val="1"/>
+      <w:numFmt w:val="lowerLetter"/>
+      <w:lvlText w:val="%8."/>
+      <w:lvlJc w:val="left"/>
+      <w:pPr>
+        <w:ind w:left="5760" w:hanging="360"/>
+      </w:pPr>
+    </w:lvl>
+    <w:lvl w:ilvl="8" w:tplc="FFFFFFFF" w:tentative="1">
+      <w:start w:val="1"/>
+      <w:numFmt w:val="lowerRoman"/>
+      <w:lvlText w:val="%9."/>
+      <w:lvlJc w:val="right"/>
+      <w:pPr>
+        <w:ind w:left="6480" w:hanging="180"/>
+      </w:pPr>
+    </w:lvl>
+  </w:abstractNum>
+  <w:abstractNum w:abstractNumId="15" w15:restartNumberingAfterBreak="0">
     <w:nsid w:val="5E052125"/>
     <w:multiLevelType w:val="hybridMultilevel"/>
     <w:tmpl w:val="A0B60B14"/>
@@ -4459,7 +5068,7 @@
       </w:pPr>
     </w:lvl>
   </w:abstractNum>
-  <w:abstractNum w:abstractNumId="13" w15:restartNumberingAfterBreak="0">
+  <w:abstractNum w:abstractNumId="16" w15:restartNumberingAfterBreak="0">
     <w:nsid w:val="6E9509F6"/>
     <w:multiLevelType w:val="hybridMultilevel"/>
     <w:tmpl w:val="C4707E64"/>
@@ -4548,7 +5157,7 @@
       </w:pPr>
     </w:lvl>
   </w:abstractNum>
-  <w:abstractNum w:abstractNumId="14" w15:restartNumberingAfterBreak="0">
+  <w:abstractNum w:abstractNumId="17" w15:restartNumberingAfterBreak="0">
     <w:nsid w:val="78826632"/>
     <w:multiLevelType w:val="hybridMultilevel"/>
     <w:tmpl w:val="8D6E33C2"/>
@@ -4637,7 +5246,7 @@
       </w:pPr>
     </w:lvl>
   </w:abstractNum>
-  <w:abstractNum w:abstractNumId="15" w15:restartNumberingAfterBreak="0">
+  <w:abstractNum w:abstractNumId="18" w15:restartNumberingAfterBreak="0">
     <w:nsid w:val="794F22B7"/>
     <w:multiLevelType w:val="hybridMultilevel"/>
     <w:tmpl w:val="41DCEF7A"/>
@@ -4729,7 +5338,7 @@
       </w:pPr>
     </w:lvl>
   </w:abstractNum>
-  <w:abstractNum w:abstractNumId="16" w15:restartNumberingAfterBreak="0">
+  <w:abstractNum w:abstractNumId="19" w15:restartNumberingAfterBreak="0">
     <w:nsid w:val="7A352756"/>
     <w:multiLevelType w:val="hybridMultilevel"/>
     <w:tmpl w:val="99F6E5C4"/>
@@ -4815,7 +5424,96 @@
       </w:pPr>
     </w:lvl>
   </w:abstractNum>
-  <w:abstractNum w:abstractNumId="17" w15:restartNumberingAfterBreak="0">
+  <w:abstractNum w:abstractNumId="20" w15:restartNumberingAfterBreak="0">
+    <w:nsid w:val="7B7D3D1E"/>
+    <w:multiLevelType w:val="hybridMultilevel"/>
+    <w:tmpl w:val="02BE9A90"/>
+    <w:lvl w:ilvl="0" w:tplc="FFFFFFFF">
+      <w:start w:val="1"/>
+      <w:numFmt w:val="decimal"/>
+      <w:lvlText w:val="%1."/>
+      <w:lvlJc w:val="left"/>
+      <w:pPr>
+        <w:ind w:left="1068" w:hanging="360"/>
+      </w:pPr>
+      <w:rPr>
+        <w:rFonts w:hint="default"/>
+      </w:rPr>
+    </w:lvl>
+    <w:lvl w:ilvl="1" w:tplc="FFFFFFFF">
+      <w:start w:val="1"/>
+      <w:numFmt w:val="lowerLetter"/>
+      <w:lvlText w:val="%2."/>
+      <w:lvlJc w:val="left"/>
+      <w:pPr>
+        <w:ind w:left="1440" w:hanging="360"/>
+      </w:pPr>
+    </w:lvl>
+    <w:lvl w:ilvl="2" w:tplc="FFFFFFFF" w:tentative="1">
+      <w:start w:val="1"/>
+      <w:numFmt w:val="lowerRoman"/>
+      <w:lvlText w:val="%3."/>
+      <w:lvlJc w:val="right"/>
+      <w:pPr>
+        <w:ind w:left="2160" w:hanging="180"/>
+      </w:pPr>
+    </w:lvl>
+    <w:lvl w:ilvl="3" w:tplc="FFFFFFFF" w:tentative="1">
+      <w:start w:val="1"/>
+      <w:numFmt w:val="decimal"/>
+      <w:lvlText w:val="%4."/>
+      <w:lvlJc w:val="left"/>
+      <w:pPr>
+        <w:ind w:left="2880" w:hanging="360"/>
+      </w:pPr>
+    </w:lvl>
+    <w:lvl w:ilvl="4" w:tplc="FFFFFFFF" w:tentative="1">
+      <w:start w:val="1"/>
+      <w:numFmt w:val="lowerLetter"/>
+      <w:lvlText w:val="%5."/>
+      <w:lvlJc w:val="left"/>
+      <w:pPr>
+        <w:ind w:left="3600" w:hanging="360"/>
+      </w:pPr>
+    </w:lvl>
+    <w:lvl w:ilvl="5" w:tplc="FFFFFFFF" w:tentative="1">
+      <w:start w:val="1"/>
+      <w:numFmt w:val="lowerRoman"/>
+      <w:lvlText w:val="%6."/>
+      <w:lvlJc w:val="right"/>
+      <w:pPr>
+        <w:ind w:left="4320" w:hanging="180"/>
+      </w:pPr>
+    </w:lvl>
+    <w:lvl w:ilvl="6" w:tplc="FFFFFFFF" w:tentative="1">
+      <w:start w:val="1"/>
+      <w:numFmt w:val="decimal"/>
+      <w:lvlText w:val="%7."/>
+      <w:lvlJc w:val="left"/>
+      <w:pPr>
+        <w:ind w:left="5040" w:hanging="360"/>
+      </w:pPr>
+    </w:lvl>
+    <w:lvl w:ilvl="7" w:tplc="FFFFFFFF" w:tentative="1">
+      <w:start w:val="1"/>
+      <w:numFmt w:val="lowerLetter"/>
+      <w:lvlText w:val="%8."/>
+      <w:lvlJc w:val="left"/>
+      <w:pPr>
+        <w:ind w:left="5760" w:hanging="360"/>
+      </w:pPr>
+    </w:lvl>
+    <w:lvl w:ilvl="8" w:tplc="FFFFFFFF" w:tentative="1">
+      <w:start w:val="1"/>
+      <w:numFmt w:val="lowerRoman"/>
+      <w:lvlText w:val="%9."/>
+      <w:lvlJc w:val="right"/>
+      <w:pPr>
+        <w:ind w:left="6480" w:hanging="180"/>
+      </w:pPr>
+    </w:lvl>
+  </w:abstractNum>
+  <w:abstractNum w:abstractNumId="21" w15:restartNumberingAfterBreak="0">
     <w:nsid w:val="7BCC0707"/>
     <w:multiLevelType w:val="hybridMultilevel"/>
     <w:tmpl w:val="1FD20C20"/>
@@ -4904,7 +5602,7 @@
       </w:pPr>
     </w:lvl>
   </w:abstractNum>
-  <w:abstractNum w:abstractNumId="18" w15:restartNumberingAfterBreak="0">
+  <w:abstractNum w:abstractNumId="22" w15:restartNumberingAfterBreak="0">
     <w:nsid w:val="7D8A5B06"/>
     <w:multiLevelType w:val="hybridMultilevel"/>
     <w:tmpl w:val="60F637A6"/>
@@ -4994,7 +5692,7 @@
     </w:lvl>
   </w:abstractNum>
   <w:num w:numId="1" w16cid:durableId="384918460">
-    <w:abstractNumId w:val="9"/>
+    <w:abstractNumId w:val="11"/>
   </w:num>
   <w:num w:numId="2" w16cid:durableId="1333800662">
     <w:abstractNumId w:val="2"/>
@@ -5003,52 +5701,64 @@
     <w:abstractNumId w:val="1"/>
   </w:num>
   <w:num w:numId="4" w16cid:durableId="1179809786">
-    <w:abstractNumId w:val="8"/>
+    <w:abstractNumId w:val="10"/>
   </w:num>
   <w:num w:numId="5" w16cid:durableId="2046248907">
-    <w:abstractNumId w:val="6"/>
+    <w:abstractNumId w:val="7"/>
   </w:num>
   <w:num w:numId="6" w16cid:durableId="1851681700">
-    <w:abstractNumId w:val="5"/>
+    <w:abstractNumId w:val="6"/>
   </w:num>
   <w:num w:numId="7" w16cid:durableId="1327127833">
     <w:abstractNumId w:val="4"/>
   </w:num>
   <w:num w:numId="8" w16cid:durableId="680012895">
+    <w:abstractNumId w:val="19"/>
+  </w:num>
+  <w:num w:numId="9" w16cid:durableId="2146462852">
+    <w:abstractNumId w:val="12"/>
+  </w:num>
+  <w:num w:numId="10" w16cid:durableId="1352608018">
+    <w:abstractNumId w:val="15"/>
+  </w:num>
+  <w:num w:numId="11" w16cid:durableId="3671579">
+    <w:abstractNumId w:val="18"/>
+  </w:num>
+  <w:num w:numId="12" w16cid:durableId="16778576">
+    <w:abstractNumId w:val="22"/>
+  </w:num>
+  <w:num w:numId="13" w16cid:durableId="760375188">
     <w:abstractNumId w:val="16"/>
   </w:num>
-  <w:num w:numId="9" w16cid:durableId="2146462852">
-    <w:abstractNumId w:val="10"/>
-  </w:num>
-  <w:num w:numId="10" w16cid:durableId="1352608018">
-    <w:abstractNumId w:val="12"/>
-  </w:num>
-  <w:num w:numId="11" w16cid:durableId="3671579">
-    <w:abstractNumId w:val="15"/>
-  </w:num>
-  <w:num w:numId="12" w16cid:durableId="16778576">
-    <w:abstractNumId w:val="18"/>
-  </w:num>
-  <w:num w:numId="13" w16cid:durableId="760375188">
-    <w:abstractNumId w:val="13"/>
-  </w:num>
   <w:num w:numId="14" w16cid:durableId="1206983854">
-    <w:abstractNumId w:val="17"/>
+    <w:abstractNumId w:val="21"/>
   </w:num>
   <w:num w:numId="15" w16cid:durableId="1485704189">
     <w:abstractNumId w:val="3"/>
   </w:num>
   <w:num w:numId="16" w16cid:durableId="332606624">
-    <w:abstractNumId w:val="7"/>
+    <w:abstractNumId w:val="8"/>
   </w:num>
   <w:num w:numId="17" w16cid:durableId="564536294">
-    <w:abstractNumId w:val="14"/>
+    <w:abstractNumId w:val="17"/>
   </w:num>
   <w:num w:numId="18" w16cid:durableId="1315724052">
-    <w:abstractNumId w:val="11"/>
+    <w:abstractNumId w:val="13"/>
   </w:num>
   <w:num w:numId="19" w16cid:durableId="673187625">
     <w:abstractNumId w:val="0"/>
+  </w:num>
+  <w:num w:numId="20" w16cid:durableId="366569309">
+    <w:abstractNumId w:val="5"/>
+  </w:num>
+  <w:num w:numId="21" w16cid:durableId="1218201705">
+    <w:abstractNumId w:val="9"/>
+  </w:num>
+  <w:num w:numId="22" w16cid:durableId="1585258165">
+    <w:abstractNumId w:val="20"/>
+  </w:num>
+  <w:num w:numId="23" w16cid:durableId="1210075315">
+    <w:abstractNumId w:val="14"/>
   </w:num>
 </w:numbering>
 </file>

</xml_diff>